<commit_message>
Update IEEE paper - fix footer
</commit_message>
<xml_diff>
--- a/article/RAG_Android_IEEE_Paper.docx
+++ b/article/RAG_Android_IEEE_Paper.docx
@@ -2695,7 +2695,7 @@
         <w:sz w:val="16"/>
         <w:szCs w:val="16"/>
       </w:rPr>
-      <w:t xml:space="preserve">978-X-XXXX-XXXX-X/25 — Experimental Evaluation of RAG Strategies — </w:t>
+      <w:t xml:space="preserve">Flávio Antonio Oliveira da Silva — Desafio Técnico SIDIA 2025 — </w:t>
     </w:r>
     <w:r>
       <w:rPr>
@@ -2759,10 +2759,10 @@
 <file path=word/numbering.xml><?xml version="1.0" encoding="utf-8"?>
 <w:numbering xmlns:wpc="http://schemas.microsoft.com/office/word/2010/wordprocessingCanvas" xmlns:cx="http://schemas.microsoft.com/office/drawing/2014/chartex" xmlns:cx1="http://schemas.microsoft.com/office/drawing/2015/9/8/chartex" xmlns:cx2="http://schemas.microsoft.com/office/drawing/2015/10/21/chartex" xmlns:cx3="http://schemas.microsoft.com/office/drawing/2016/5/9/chartex" xmlns:cx4="http://schemas.microsoft.com/office/drawing/2016/5/10/chartex" xmlns:cx5="http://schemas.microsoft.com/office/drawing/2016/5/11/chartex" xmlns:cx6="http://schemas.microsoft.com/office/drawing/2016/5/12/chartex" xmlns:cx7="http://schemas.microsoft.com/office/drawing/2016/5/13/chartex" xmlns:cx8="http://schemas.microsoft.com/office/drawing/2016/5/14/chartex" xmlns:mc="http://schemas.openxmlformats.org/markup-compatibility/2006" xmlns:aink="http://schemas.microsoft.com/office/drawing/2016/ink" xmlns:am3d="http://schemas.microsoft.com/office/drawing/2017/model3d" xmlns:o="urn:schemas-microsoft-com:office:office" xmlns:oel="http://schemas.microsoft.com/office/2019/extlst" xmlns:r="http://schemas.openxmlformats.org/officeDocument/2006/relationships" xmlns:m="http://schemas.openxmlformats.org/officeDocument/2006/math" xmlns:v="urn:schemas-microsoft-com:vml" xmlns:wp14="http://schemas.microsoft.com/office/word/2010/wordprocessingDrawing" xmlns:wp="http://schemas.openxmlformats.org/drawingml/2006/wordprocessingDrawing" xmlns:w10="urn:schemas-microsoft-com:office:word" xmlns:w="http://schemas.openxmlformats.org/wordprocessingml/2006/main" xmlns:w14="http://schemas.microsoft.com/office/word/2010/wordml" xmlns:w15="http://schemas.microsoft.com/office/word/2012/wordml" xmlns:w16cex="http://schemas.microsoft.com/office/word/2018/wordml/cex" xmlns:w16cid="http://schemas.microsoft.com/office/word/2016/wordml/cid" xmlns:w16="http://schemas.microsoft.com/office/word/2018/wordml" xmlns:w16du="http://schemas.microsoft.com/office/word/2023/wordml/word16du" xmlns:w16sdtdh="http://schemas.microsoft.com/office/word/2020/wordml/sdtdatahash" xmlns:w16sdtfl="http://schemas.microsoft.com/office/word/2024/wordml/sdtformatlock" xmlns:w16se="http://schemas.microsoft.com/office/word/2015/wordml/symex" xmlns:wpg="http://schemas.microsoft.com/office/word/2010/wordprocessingGroup" xmlns:wpi="http://schemas.microsoft.com/office/word/2010/wordprocessingInk" xmlns:wne="http://schemas.microsoft.com/office/word/2006/wordml" xmlns:wps="http://schemas.microsoft.com/office/word/2010/wordprocessingShape" mc:Ignorable="w14 w15 w16se w16cid w16 w16cex w16sdtdh w16sdtfl w16du wp14">
   <w:abstractNum w:abstractNumId="0" w15:restartNumberingAfterBreak="0">
-    <w:nsid w:val="67FF5E3C"/>
+    <w:nsid w:val="36B32F16"/>
     <w:multiLevelType w:val="hybridMultilevel"/>
-    <w:tmpl w:val="BBE605D0"/>
-    <w:lvl w:ilvl="0" w:tplc="7812CF9E">
+    <w:tmpl w:val="DFB49258"/>
+    <w:lvl w:ilvl="0" w:tplc="B164C504">
       <w:start w:val="1"/>
       <w:numFmt w:val="bullet"/>
       <w:lvlText w:val="●"/>
@@ -2771,7 +2771,7 @@
         <w:ind w:left="720" w:hanging="360"/>
       </w:pPr>
     </w:lvl>
-    <w:lvl w:ilvl="1" w:tplc="6A68B5B6">
+    <w:lvl w:ilvl="1" w:tplc="D3AAD9E4">
       <w:start w:val="1"/>
       <w:numFmt w:val="bullet"/>
       <w:lvlText w:val="○"/>
@@ -2780,7 +2780,7 @@
         <w:ind w:left="1440" w:hanging="360"/>
       </w:pPr>
     </w:lvl>
-    <w:lvl w:ilvl="2" w:tplc="AD68FA22">
+    <w:lvl w:ilvl="2" w:tplc="8A544A5A">
       <w:start w:val="1"/>
       <w:numFmt w:val="bullet"/>
       <w:lvlText w:val="■"/>
@@ -2789,7 +2789,7 @@
         <w:ind w:left="2160" w:hanging="360"/>
       </w:pPr>
     </w:lvl>
-    <w:lvl w:ilvl="3" w:tplc="959E5DF8">
+    <w:lvl w:ilvl="3" w:tplc="C4849DA2">
       <w:start w:val="1"/>
       <w:numFmt w:val="bullet"/>
       <w:lvlText w:val="●"/>
@@ -2798,7 +2798,7 @@
         <w:ind w:left="2880" w:hanging="360"/>
       </w:pPr>
     </w:lvl>
-    <w:lvl w:ilvl="4" w:tplc="60B0D72A">
+    <w:lvl w:ilvl="4" w:tplc="CDF00918">
       <w:start w:val="1"/>
       <w:numFmt w:val="bullet"/>
       <w:lvlText w:val="○"/>
@@ -2807,7 +2807,7 @@
         <w:ind w:left="3600" w:hanging="360"/>
       </w:pPr>
     </w:lvl>
-    <w:lvl w:ilvl="5" w:tplc="00B8F1B4">
+    <w:lvl w:ilvl="5" w:tplc="5C42EB60">
       <w:start w:val="1"/>
       <w:numFmt w:val="bullet"/>
       <w:lvlText w:val="■"/>
@@ -2816,7 +2816,7 @@
         <w:ind w:left="4320" w:hanging="360"/>
       </w:pPr>
     </w:lvl>
-    <w:lvl w:ilvl="6" w:tplc="50F09DA2">
+    <w:lvl w:ilvl="6" w:tplc="6D64EF32">
       <w:start w:val="1"/>
       <w:numFmt w:val="bullet"/>
       <w:lvlText w:val="●"/>
@@ -2825,7 +2825,7 @@
         <w:ind w:left="5040" w:hanging="360"/>
       </w:pPr>
     </w:lvl>
-    <w:lvl w:ilvl="7" w:tplc="D1E00F0E">
+    <w:lvl w:ilvl="7" w:tplc="E34A3228">
       <w:start w:val="1"/>
       <w:numFmt w:val="bullet"/>
       <w:lvlText w:val="●"/>
@@ -2834,7 +2834,7 @@
         <w:ind w:left="5760" w:hanging="360"/>
       </w:pPr>
     </w:lvl>
-    <w:lvl w:ilvl="8" w:tplc="D3A85928">
+    <w:lvl w:ilvl="8" w:tplc="9906160E">
       <w:start w:val="1"/>
       <w:numFmt w:val="bullet"/>
       <w:lvlText w:val="●"/>
@@ -2844,7 +2844,7 @@
       </w:pPr>
     </w:lvl>
   </w:abstractNum>
-  <w:num w:numId="1" w16cid:durableId="225796786">
+  <w:num w:numId="1" w16cid:durableId="40129786">
     <w:abstractNumId w:val="0"/>
     <w:lvlOverride w:ilvl="0">
       <w:startOverride w:val="1"/>

</xml_diff>